<commit_message>
Tom Klootwijk's practical substrate compression E.I. De Jong
</commit_message>
<xml_diff>
--- a/Klootwijk/klb_seedchain_gpu_v0.2.0/klb_seedchain_gpu_v0.2.0/KLB_SeedChain_GPU_v0.2.0_ELI5_Verification_Report.docx
+++ b/Klootwijk/klb_seedchain_gpu_v0.2.0/klb_seedchain_gpu_v0.2.0/KLB_SeedChain_GPU_v0.2.0_ELI5_Verification_Report.docx
@@ -96,6 +96,9 @@
         <w:gridCol w:w="9360"/>
       </w:tblGrid>
       <w:tr>
+        <w:trPr>
+          <w:tblHeader w:val="true"/>
+        </w:trPr>
         <w:tc>
           <w:tcPr>
             <w:tcW w:type="dxa" w:w="9360"/>
@@ -161,6 +164,9 @@
         <w:gridCol w:w="3120"/>
       </w:tblGrid>
       <w:tr>
+        <w:trPr>
+          <w:tblHeader w:val="true"/>
+        </w:trPr>
         <w:tc>
           <w:tcPr>
             <w:tcW w:type="dxa" w:w="3120"/>
@@ -352,9 +358,36 @@
     </w:p>
     <w:p>
       <w:pPr>
+        <w:sectPr>
+          <w:footerReference w:type="default" r:id="rId9"/>
+          <w:footerReference w:type="first" r:id="rId10"/>
+          <w:pgSz w:w="12240" w:h="15840"/>
+          <w:pgMar w:top="1440" w:right="1440" w:bottom="1440" w:left="1440" w:header="708" w:footer="708" w:gutter="0"/>
+          <w:cols w:space="720"/>
+          <w:titlePg/>
+          <w:docGrid w:linePitch="360"/>
+        </w:sectPr>
+      </w:pPr>
+    </w:p>
+    <w:p>
+      <w:pPr>
+        <w:keepNext/>
+        <w:spacing w:before="0" w:after="240"/>
+      </w:pPr>
+      <w:r>
+        <w:rPr>
+          <w:rFonts w:ascii="Calibri" w:hAnsi="Calibri" w:eastAsia="Calibri"/>
+          <w:b/>
+          <w:color w:val="5E6670"/>
+          <w:sz w:val="18"/>
+        </w:rPr>
+        <w:t>KLB SeedChain GPU 0.2.0  |  Independent verification</w:t>
+      </w:r>
+    </w:p>
+    <w:p>
+      <w:pPr>
         <w:pStyle w:val="Heading1"/>
         <w:keepNext/>
-        <w:pageBreakBefore/>
       </w:pPr>
       <w:r>
         <w:t>1. The answer in plain English</w:t>
@@ -380,6 +413,9 @@
         <w:gridCol w:w="9360"/>
       </w:tblGrid>
       <w:tr>
+        <w:trPr>
+          <w:tblHeader w:val="true"/>
+        </w:trPr>
         <w:tc>
           <w:tcPr>
             <w:tcW w:type="dxa" w:w="9360"/>
@@ -1010,9 +1046,37 @@
     </w:p>
     <w:p>
       <w:pPr>
+        <w:keepNext/>
+        <w:spacing w:before="0" w:after="560"/>
+      </w:pPr>
+      <w:r>
+        <w:rPr>
+          <w:rFonts w:ascii="Calibri" w:hAnsi="Calibri" w:eastAsia="Calibri"/>
+          <w:color w:val="FFFFFF"/>
+          <w:sz w:val="2"/>
+        </w:rPr>
+        <w:t xml:space="preserve"> </w:t>
+      </w:r>
+    </w:p>
+    <w:p>
+      <w:pPr>
+        <w:keepNext/>
+        <w:spacing w:before="0" w:after="240"/>
+      </w:pPr>
+      <w:r>
+        <w:rPr>
+          <w:rFonts w:ascii="Calibri" w:hAnsi="Calibri" w:eastAsia="Calibri"/>
+          <w:b/>
+          <w:color w:val="5E6670"/>
+          <w:sz w:val="18"/>
+        </w:rPr>
+        <w:t>KLB SeedChain GPU 0.2.0  |  Independent verification</w:t>
+      </w:r>
+    </w:p>
+    <w:p>
+      <w:pPr>
         <w:pStyle w:val="Heading1"/>
         <w:keepNext/>
-        <w:pageBreakBefore/>
       </w:pPr>
       <w:r>
         <w:t>3. How SeedChain works (ELI5)</w:t>
@@ -1136,6 +1200,9 @@
         <w:gridCol w:w="9360"/>
       </w:tblGrid>
       <w:tr>
+        <w:trPr>
+          <w:tblHeader w:val="true"/>
+        </w:trPr>
         <w:tc>
           <w:tcPr>
             <w:tcW w:type="dxa" w:w="9360"/>
@@ -1998,9 +2065,37 @@
     </w:p>
     <w:p>
       <w:pPr>
+        <w:keepNext/>
+        <w:spacing w:before="0" w:after="560"/>
+      </w:pPr>
+      <w:r>
+        <w:rPr>
+          <w:rFonts w:ascii="Calibri" w:hAnsi="Calibri" w:eastAsia="Calibri"/>
+          <w:color w:val="FFFFFF"/>
+          <w:sz w:val="2"/>
+        </w:rPr>
+        <w:t xml:space="preserve"> </w:t>
+      </w:r>
+    </w:p>
+    <w:p>
+      <w:pPr>
+        <w:keepNext/>
+        <w:spacing w:before="0" w:after="240"/>
+      </w:pPr>
+      <w:r>
+        <w:rPr>
+          <w:rFonts w:ascii="Calibri" w:hAnsi="Calibri" w:eastAsia="Calibri"/>
+          <w:b/>
+          <w:color w:val="5E6670"/>
+          <w:sz w:val="18"/>
+        </w:rPr>
+        <w:t>KLB SeedChain GPU 0.2.0  |  Independent verification</w:t>
+      </w:r>
+    </w:p>
+    <w:p>
+      <w:pPr>
         <w:pStyle w:val="Heading1"/>
         <w:keepNext/>
-        <w:pageBreakBefore/>
       </w:pPr>
       <w:r>
         <w:t>5. The generic fitter reality check</w:t>
@@ -2928,6 +3023,9 @@
         <w:gridCol w:w="9360"/>
       </w:tblGrid>
       <w:tr>
+        <w:trPr>
+          <w:tblHeader w:val="true"/>
+        </w:trPr>
         <w:tc>
           <w:tcPr>
             <w:tcW w:type="dxa" w:w="9360"/>
@@ -4224,9 +4322,33 @@
     </w:p>
     <w:p>
       <w:pPr>
+        <w:sectPr>
+          <w:pgSz w:w="12240" w:h="15840"/>
+          <w:pgMar w:top="720" w:right="1440" w:bottom="1440" w:left="1440" w:header="708" w:footer="708" w:gutter="0"/>
+          <w:cols w:space="720"/>
+          <w:docGrid w:linePitch="360"/>
+        </w:sectPr>
+      </w:pPr>
+    </w:p>
+    <w:p>
+      <w:pPr>
+        <w:keepNext/>
+        <w:spacing w:before="0" w:after="240"/>
+      </w:pPr>
+      <w:r>
+        <w:rPr>
+          <w:rFonts w:ascii="Calibri" w:hAnsi="Calibri" w:eastAsia="Calibri"/>
+          <w:b/>
+          <w:color w:val="5E6670"/>
+          <w:sz w:val="18"/>
+        </w:rPr>
+        <w:t>KLB SeedChain GPU 0.2.0  |  Independent verification</w:t>
+      </w:r>
+    </w:p>
+    <w:p>
+      <w:pPr>
         <w:pStyle w:val="Heading2"/>
         <w:keepNext/>
-        <w:pageBreakBefore/>
       </w:pPr>
       <w:r>
         <w:t>Repeatability at final frame (30 fresh processes)</w:t>
@@ -4879,6 +5001,9 @@
         <w:gridCol w:w="9360"/>
       </w:tblGrid>
       <w:tr>
+        <w:trPr>
+          <w:tblHeader w:val="true"/>
+        </w:trPr>
         <w:tc>
           <w:tcPr>
             <w:tcW w:type="dxa" w:w="9360"/>
@@ -4950,9 +5075,47 @@
     </w:p>
     <w:p>
       <w:pPr>
+        <w:sectPr>
+          <w:pgSz w:w="12240" w:h="15840"/>
+          <w:pgMar w:top="720" w:right="1440" w:bottom="1440" w:left="1440" w:header="708" w:footer="708" w:gutter="0"/>
+          <w:cols w:space="720"/>
+          <w:docGrid w:linePitch="360"/>
+        </w:sectPr>
+      </w:pPr>
+    </w:p>
+    <w:p>
+      <w:pPr>
+        <w:keepNext/>
+        <w:spacing w:before="0" w:after="1120"/>
+      </w:pPr>
+      <w:r>
+        <w:rPr>
+          <w:rFonts w:ascii="Calibri" w:hAnsi="Calibri" w:eastAsia="Calibri"/>
+          <w:color w:val="FFFFFF"/>
+          <w:sz w:val="2"/>
+        </w:rPr>
+        <w:t xml:space="preserve"> </w:t>
+      </w:r>
+    </w:p>
+    <w:p>
+      <w:pPr>
+        <w:keepNext/>
+        <w:spacing w:before="0" w:after="240"/>
+      </w:pPr>
+      <w:r>
+        <w:rPr>
+          <w:rFonts w:ascii="Calibri" w:hAnsi="Calibri" w:eastAsia="Calibri"/>
+          <w:b/>
+          <w:color w:val="5E6670"/>
+          <w:sz w:val="18"/>
+        </w:rPr>
+        <w:t>KLB SeedChain GPU 0.2.0  |  Independent verification</w:t>
+      </w:r>
+    </w:p>
+    <w:p>
+      <w:pPr>
         <w:pStyle w:val="Heading1"/>
         <w:keepNext/>
-        <w:pageBreakBefore/>
       </w:pPr>
       <w:r>
         <w:t>8. Correctness evidence</w:t>
@@ -5109,9 +5272,33 @@
     </w:p>
     <w:p>
       <w:pPr>
+        <w:sectPr>
+          <w:pgSz w:w="12240" w:h="15840"/>
+          <w:pgMar w:top="720" w:right="1440" w:bottom="1440" w:left="1440" w:header="708" w:footer="708" w:gutter="0"/>
+          <w:cols w:space="720"/>
+          <w:docGrid w:linePitch="360"/>
+        </w:sectPr>
+      </w:pPr>
+    </w:p>
+    <w:p>
+      <w:pPr>
+        <w:keepNext/>
+        <w:spacing w:before="0" w:after="240"/>
+      </w:pPr>
+      <w:r>
+        <w:rPr>
+          <w:rFonts w:ascii="Calibri" w:hAnsi="Calibri" w:eastAsia="Calibri"/>
+          <w:b/>
+          <w:color w:val="5E6670"/>
+          <w:sz w:val="18"/>
+        </w:rPr>
+        <w:t>KLB SeedChain GPU 0.2.0  |  Independent verification</w:t>
+      </w:r>
+    </w:p>
+    <w:p>
+      <w:pPr>
         <w:pStyle w:val="Heading1"/>
         <w:keepNext/>
-        <w:pageBreakBefore/>
       </w:pPr>
       <w:r>
         <w:t>9. Practical use cases</w:t>
@@ -5137,6 +5324,9 @@
         <w:gridCol w:w="9360"/>
       </w:tblGrid>
       <w:tr>
+        <w:trPr>
+          <w:tblHeader w:val="true"/>
+        </w:trPr>
         <w:tc>
           <w:tcPr>
             <w:tcW w:type="dxa" w:w="9360"/>
@@ -5179,6 +5369,15 @@
       <w:pPr>
         <w:spacing w:after="80"/>
       </w:pPr>
+    </w:p>
+    <w:p>
+      <w:pPr>
+        <w:pStyle w:val="Heading2"/>
+        <w:keepNext/>
+      </w:pPr>
+      <w:r>
+        <w:t>Suitable workloads</w:t>
+      </w:r>
     </w:p>
     <w:p>
       <w:pPr>
@@ -5408,9 +5607,37 @@
     </w:p>
     <w:p>
       <w:pPr>
+        <w:keepNext/>
+        <w:spacing w:before="0" w:after="560"/>
+      </w:pPr>
+      <w:r>
+        <w:rPr>
+          <w:rFonts w:ascii="Calibri" w:hAnsi="Calibri" w:eastAsia="Calibri"/>
+          <w:color w:val="FFFFFF"/>
+          <w:sz w:val="2"/>
+        </w:rPr>
+        <w:t xml:space="preserve"> </w:t>
+      </w:r>
+    </w:p>
+    <w:p>
+      <w:pPr>
+        <w:keepNext/>
+        <w:spacing w:before="0" w:after="240"/>
+      </w:pPr>
+      <w:r>
+        <w:rPr>
+          <w:rFonts w:ascii="Calibri" w:hAnsi="Calibri" w:eastAsia="Calibri"/>
+          <w:b/>
+          <w:color w:val="5E6670"/>
+          <w:sz w:val="18"/>
+        </w:rPr>
+        <w:t>KLB SeedChain GPU 0.2.0  |  Independent verification</w:t>
+      </w:r>
+    </w:p>
+    <w:p>
+      <w:pPr>
         <w:pStyle w:val="Heading1"/>
         <w:keepNext/>
-        <w:pageBreakBefore/>
       </w:pPr>
       <w:r>
         <w:t>10. Limitations and issues found</w:t>
@@ -5538,9 +5765,33 @@
     </w:p>
     <w:p>
       <w:pPr>
+        <w:sectPr>
+          <w:pgSz w:w="12240" w:h="15840"/>
+          <w:pgMar w:top="720" w:right="1440" w:bottom="1440" w:left="1440" w:header="708" w:footer="708" w:gutter="0"/>
+          <w:cols w:space="720"/>
+          <w:docGrid w:linePitch="360"/>
+        </w:sectPr>
+      </w:pPr>
+    </w:p>
+    <w:p>
+      <w:pPr>
+        <w:keepNext/>
+        <w:spacing w:before="0" w:after="240"/>
+      </w:pPr>
+      <w:r>
+        <w:rPr>
+          <w:rFonts w:ascii="Calibri" w:hAnsi="Calibri" w:eastAsia="Calibri"/>
+          <w:b/>
+          <w:color w:val="5E6670"/>
+          <w:sz w:val="18"/>
+        </w:rPr>
+        <w:t>KLB SeedChain GPU 0.2.0  |  Independent verification</w:t>
+      </w:r>
+    </w:p>
+    <w:p>
+      <w:pPr>
         <w:pStyle w:val="Heading1"/>
         <w:keepNext/>
-        <w:pageBreakBefore/>
       </w:pPr>
       <w:r>
         <w:t>11. Recommended next engineering steps</w:t>
@@ -5702,6 +5953,9 @@
         <w:gridCol w:w="9360"/>
       </w:tblGrid>
       <w:tr>
+        <w:trPr>
+          <w:tblHeader w:val="true"/>
+        </w:trPr>
         <w:tc>
           <w:tcPr>
             <w:tcW w:type="dxa" w:w="9360"/>
@@ -5747,9 +6001,47 @@
     </w:p>
     <w:p>
       <w:pPr>
+        <w:sectPr>
+          <w:pgSz w:w="12240" w:h="15840"/>
+          <w:pgMar w:top="720" w:right="1440" w:bottom="1440" w:left="1440" w:header="708" w:footer="708" w:gutter="0"/>
+          <w:cols w:space="720"/>
+          <w:docGrid w:linePitch="360"/>
+        </w:sectPr>
+      </w:pPr>
+    </w:p>
+    <w:p>
+      <w:pPr>
+        <w:keepNext/>
+        <w:spacing w:before="0" w:after="1520"/>
+      </w:pPr>
+      <w:r>
+        <w:rPr>
+          <w:rFonts w:ascii="Calibri" w:hAnsi="Calibri" w:eastAsia="Calibri"/>
+          <w:color w:val="FFFFFF"/>
+          <w:sz w:val="2"/>
+        </w:rPr>
+        <w:t xml:space="preserve"> </w:t>
+      </w:r>
+    </w:p>
+    <w:p>
+      <w:pPr>
+        <w:keepNext/>
+        <w:spacing w:before="0" w:after="240"/>
+      </w:pPr>
+      <w:r>
+        <w:rPr>
+          <w:rFonts w:ascii="Calibri" w:hAnsi="Calibri" w:eastAsia="Calibri"/>
+          <w:b/>
+          <w:color w:val="5E6670"/>
+          <w:sz w:val="18"/>
+        </w:rPr>
+        <w:t>KLB SeedChain GPU 0.2.0  |  Independent verification</w:t>
+      </w:r>
+    </w:p>
+    <w:p>
+      <w:pPr>
         <w:pStyle w:val="Heading1"/>
         <w:keepNext/>
-        <w:pageBreakBefore/>
       </w:pPr>
       <w:r>
         <w:t>Appendix A. Evidence and commands</w:t>
@@ -6377,13 +6669,9 @@
       </w:r>
     </w:p>
     <w:sectPr>
-      <w:headerReference w:type="default" r:id="rId9"/>
-      <w:footerReference w:type="default" r:id="rId10"/>
-      <w:footerReference w:type="first" r:id="rId11"/>
       <w:pgSz w:w="12240" w:h="15840"/>
-      <w:pgMar w:top="1440" w:right="1440" w:bottom="1440" w:left="1440" w:header="708" w:footer="708" w:gutter="0"/>
+      <w:pgMar w:top="720" w:right="1440" w:bottom="1440" w:left="1440" w:header="708" w:footer="708" w:gutter="0"/>
       <w:cols w:space="720"/>
-      <w:titlePg/>
       <w:docGrid w:linePitch="360"/>
     </w:sectPr>
   </w:body>
@@ -6453,27 +6741,6 @@
     </w:r>
   </w:p>
 </w:ftr>
-</file>
-
-<file path=word/header1.xml><?xml version="1.0" encoding="utf-8"?>
-<w:hdr xmlns:m="http://schemas.openxmlformats.org/officeDocument/2006/math" xmlns:mc="http://schemas.openxmlformats.org/markup-compatibility/2006" xmlns:mo="http://schemas.microsoft.com/office/mac/office/2008/main" xmlns:mv="urn:schemas-microsoft-com:mac:vml" xmlns:o="urn:schemas-microsoft-com:office:office" xmlns:r="http://schemas.openxmlformats.org/officeDocument/2006/relationships" xmlns:v="urn:schemas-microsoft-com:vml" xmlns:w10="urn:schemas-microsoft-com:office:word" xmlns:w14="http://schemas.microsoft.com/office/word/2010/wordml" xmlns:w="http://schemas.openxmlformats.org/wordprocessingml/2006/main" xmlns:wne="http://schemas.microsoft.com/office/word/2006/wordml" xmlns:wp14="http://schemas.microsoft.com/office/word/2010/wordprocessingDrawing" xmlns:wp="http://schemas.openxmlformats.org/drawingml/2006/wordprocessingDrawing" xmlns:wpc="http://schemas.microsoft.com/office/word/2010/wordprocessingCanvas" xmlns:wpg="http://schemas.microsoft.com/office/word/2010/wordprocessingGroup" xmlns:wpi="http://schemas.microsoft.com/office/word/2010/wordprocessingInk" xmlns:wps="http://schemas.microsoft.com/office/word/2010/wordprocessingShape" mc:Ignorable="w14 wp14">
-  <w:p>
-    <w:pPr>
-      <w:pStyle w:val="Header"/>
-      <w:spacing w:after="0"/>
-      <w:jc w:val="left"/>
-    </w:pPr>
-    <w:r>
-      <w:rPr>
-        <w:rFonts w:ascii="Calibri" w:hAnsi="Calibri" w:eastAsia="Calibri"/>
-        <w:b/>
-        <w:color w:val="5E6670"/>
-        <w:sz w:val="18"/>
-      </w:rPr>
-      <w:t>KLB SeedChain GPU 0.2.0  |  Independent verification</w:t>
-    </w:r>
-  </w:p>
-</w:hdr>
 </file>
 
 <file path=word/numbering.xml><?xml version="1.0" encoding="utf-8"?>

</xml_diff>